<commit_message>
Promotion to Director of Digital Strategy; tab icon; book copy
- Timeline: new top role, Director of Digital Strategy at MCDP (Oct 2026 –),
  with Director of Marketing now Feb–Oct 2026 in past tense
- Hero, meta description, About and Work pages mention the new role;
  Work adds a Digital strategy specialty
- Résumé and cover letter downloads updated to match
- Book page: 'I hope you enjoyed my story so far.'
- Browser tab icon from the ohullo. logo (SVG with dark-mode variant,
  .ico fallback and Apple touch icon)

Co-Authored-By: Claude Opus 5.5 <noreply@anthropic.com>
Claude-Session: https://claude.ai/code/session_01Rjvqia3tMMqp8H12xZacAA
</commit_message>
<xml_diff>
--- a/assets/Mark_Johnson_Resume_2026web.docx
+++ b/assets/Mark_Johnson_Resume_2026web.docx
@@ -144,12 +144,78 @@
         <w:pStyle w:val="Heading2"/>
       </w:pPr>
       <w:r>
+        <w:t>Director of Digital Strategy</w:t>
+      </w:r>
+    </w:p>
+    <w:p>
+      <w:r>
+        <w:t>Motor City Dental Partners | Dallas-Fort Worth, TX | October 2026 – Present</w:t>
+      </w:r>
+    </w:p>
+    <w:p>
+      <w:pPr>
+        <w:pStyle w:val="ListParagraph"/>
+        <w:numPr>
+          <w:ilvl w:val="0"/>
+          <w:numId w:val="1"/>
+        </w:numPr>
+        <w:spacing w:after="0"/>
+      </w:pPr>
+      <w:r>
+        <w:t>Set digital strategy across the organization, aligning websites, advertising, patient-facing tools, and data with business goals.</w:t>
+      </w:r>
+    </w:p>
+    <w:p>
+      <w:pPr>
+        <w:pStyle w:val="ListParagraph"/>
+        <w:numPr>
+          <w:ilvl w:val="0"/>
+          <w:numId w:val="1"/>
+        </w:numPr>
+        <w:spacing w:after="0"/>
+      </w:pPr>
+      <w:r>
+        <w:t>Provide advanced technical guidance to leadership and practice teams on platforms, integrations, security, and vendor selection.</w:t>
+      </w:r>
+    </w:p>
+    <w:p>
+      <w:pPr>
+        <w:pStyle w:val="ListParagraph"/>
+        <w:numPr>
+          <w:ilvl w:val="0"/>
+          <w:numId w:val="1"/>
+        </w:numPr>
+        <w:spacing w:after="0"/>
+      </w:pPr>
+      <w:r>
+        <w:t>Direct the growth of technology across the organization, from evaluating and rolling out new systems to scaling supporting infrastructure.</w:t>
+      </w:r>
+    </w:p>
+    <w:p>
+      <w:pPr>
+        <w:pStyle w:val="ListParagraph"/>
+        <w:numPr>
+          <w:ilvl w:val="0"/>
+          <w:numId w:val="1"/>
+        </w:numPr>
+        <w:spacing w:after="0"/>
+      </w:pPr>
+      <w:r>
+        <w:t>Build technology roadmaps and KPIs that tie investment to patient growth, operational efficiency, and ROI.</w:t>
+      </w:r>
+    </w:p>
+    <w:p/>
+    <w:p>
+      <w:pPr>
+        <w:pStyle w:val="Heading2"/>
+      </w:pPr>
+      <w:r>
         <w:t>Director of Marketing</w:t>
       </w:r>
     </w:p>
     <w:p>
       <w:r>
-        <w:t>Motor City Dental Partners | Dallas-Fort Worth, TX | February 2026 – Present</w:t>
+        <w:t>Motor City Dental Partners | Dallas-Fort Worth, TX | February 2026 – October 2026</w:t>
       </w:r>
     </w:p>
     <w:p>
@@ -162,7 +228,7 @@
         <w:spacing w:after="0"/>
       </w:pPr>
       <w:r>
-        <w:t>Lead website ideation, coding, and management, ensuring alignment with brand identity and user experience best practices.</w:t>
+        <w:t>Led website ideation, coding, and management, ensuring alignment with brand identity and user experience best practices.</w:t>
       </w:r>
     </w:p>
     <w:p>
@@ -175,7 +241,7 @@
         <w:spacing w:after="0"/>
       </w:pPr>
       <w:r>
-        <w:t>Develop and execute digital ad campaigns across platforms (Google Ads, social media, etc.) to drive patient acquisition and brand awareness.</w:t>
+        <w:t>Developed and executed digital ad campaigns across platforms (Google Ads, social media, etc.) to drive patient acquisition and brand awareness.</w:t>
       </w:r>
     </w:p>
     <w:p>
@@ -188,7 +254,7 @@
         <w:spacing w:after="0"/>
       </w:pPr>
       <w:r>
-        <w:t>Oversee mixed media targeting strategies, including SEO, content marketing, and paid advertising, to maximize reach and conversions.</w:t>
+        <w:t>Oversaw mixed media targeting strategies, including SEO, content marketing, and paid advertising, to maximize reach and conversions.</w:t>
       </w:r>
     </w:p>
     <w:p>
@@ -201,7 +267,7 @@
         <w:spacing w:after="0"/>
       </w:pPr>
       <w:r>
-        <w:t>Collaborate with cross-functional teams to align marketing efforts with organizational goals and operational strategies.</w:t>
+        <w:t>Collaborated with cross-functional teams to align marketing efforts with organizational goals and operational strategies.</w:t>
       </w:r>
     </w:p>
     <w:p>
@@ -214,7 +280,7 @@
         <w:spacing w:after="0"/>
       </w:pPr>
       <w:r>
-        <w:t>Utilize data analytics to optimize campaigns, track KPIs, and refine targeting for improved ROI.</w:t>
+        <w:t>Utilized data analytics to optimize campaigns, track KPIs, and refine targeting for improved ROI.</w:t>
       </w:r>
     </w:p>
     <w:p/>

</xml_diff>